<commit_message>
Add hypergravity (GSE29787 2g); re-run full 22-contrast model + bridge; completion audit
- hypergravity LDC 2g via GPL9020 -> decoder_nes_matrix_v6 (22 contrasts, gravity family)
- re-ran combined heatmap, atlas (cell-type/tissue/stage), within-source bridge, F1-F6, report, manuscript
- atlas headline unchanged: radicle apical meristem hit by 4/5 stressor families
- propagated 22-contrast + hypergravity through manuscript text/figures; README completion audit (Phase 8)

Co-Authored-By: Claude Opus 4.8 <noreply@anthropic.com>
</commit_message>
<xml_diff>
--- a/report/manuscript_npj_microgravity.docx
+++ b/report/manuscript_npj_microgravity.docx
@@ -134,7 +134,7 @@
     </w:p>
     <w:p>
       <w:r>
-        <w:t>it to a 21-contrast model spanning five stressor families, we build a **DeepSpace seed-susceptibility</w:t>
+        <w:t>it to a 22-contrast model spanning five stressor families, we build a **DeepSpace seed-susceptibility</w:t>
       </w:r>
     </w:p>
     <w:p>
@@ -547,7 +547,7 @@
     </w:p>
     <w:p>
       <w:r>
-        <w:t xml:space="preserve">We assembled a 21-contrast stress reference library spanning five families: </w:t>
+        <w:t xml:space="preserve">We assembled a 22-contrast stress reference library spanning five families: </w:t>
       </w:r>
       <w:r>
         <w:rPr>
@@ -561,8 +561,10 @@
     </w:p>
     <w:p>
       <w:r>
-        <w:t xml:space="preserve">microgravity, root and leaf), </w:t>
-      </w:r>
+        <w:t>microgravity root and leaf, plus 2 g hypergravity — completing the µg↔1 g↔hypergravity axis),</w:t>
+      </w:r>
+    </w:p>
+    <w:p>
       <w:r>
         <w:rPr>
           <w:b/>
@@ -1013,12 +1015,12 @@
     </w:p>
     <w:p>
       <w:r>
-        <w:t>phototropism microarray) and sustained hypergravity lacks a clean public dataset; and several contrasts</w:t>
+        <w:t>phototropism microarray) and sustained hypergravity is represented only by a microarray-tier callus</w:t>
       </w:r>
     </w:p>
     <w:p>
       <w:r>
-        <w:t>are microarray- or translatome-tier. None of these undermines the central, multiply-supported result, and</w:t>
+        <w:t>dataset (2 g, GSE29787); and several contrasts are microarray- or translatome-tier. None of these undermines the central, multiply-supported result, and</w:t>
       </w:r>
     </w:p>
     <w:p>
@@ -1083,17 +1085,17 @@
     </w:p>
     <w:p>
       <w:r>
-        <w:t>GSE315308, GSE182724; gravitropism: GSE199142; phototropism: GSE3847). Wild-type, treatment-vs-control</w:t>
+        <w:t>GSE315308, GSE182724; gravitropism: GSE199142; phototropism: GSE3847; hypergravity: GSE29787, 2 g vs 1 g</w:t>
       </w:r>
     </w:p>
     <w:p>
       <w:r>
-        <w:t>contrasts were used. Gene identifiers were harmonized to AGI/TAIR (Entrez and Affymetrix ATH1/GPL198 maps</w:t>
+        <w:t>callus, two-color Agilent GPL9020). Wild-type, treatment-vs-control contrasts were used. Gene identifiers</w:t>
       </w:r>
     </w:p>
     <w:p>
       <w:r>
-        <w:t>provided). The null-magnetic-field panel derives from Maffei-group time-course microarrays (curated</w:t>
+        <w:t>were harmonized to AGI/TAIR (Entrez, Affymetrix ATH1/GPL198, and Agilent GPL9020 maps provided). The null-magnetic-field panel derives from Maffei-group time-course microarrays (curated</w:t>
       </w:r>
     </w:p>
     <w:p>
@@ -1280,7 +1282,18 @@
         <w:t>GSE3847</w:t>
       </w:r>
       <w:r>
-        <w:t xml:space="preserve"> (GPL198). Genome-wide</w:t>
+        <w:t xml:space="preserve"> (GPL198); hypergravity</w:t>
+      </w:r>
+    </w:p>
+    <w:p>
+      <w:r>
+        <w:rPr>
+          <w:b/>
+        </w:rPr>
+        <w:t>GSE29787</w:t>
+      </w:r>
+      <w:r>
+        <w:t xml:space="preserve"> (2 g, GPL9020). Genome-wide</w:t>
       </w:r>
     </w:p>
     <w:p>
@@ -1644,7 +1657,7 @@
       <w:r>
         <w:drawing>
           <wp:inline xmlns:a="http://schemas.openxmlformats.org/drawingml/2006/main" xmlns:pic="http://schemas.openxmlformats.org/drawingml/2006/picture">
-            <wp:extent cx="5760720" cy="3206456"/>
+            <wp:extent cx="5760720" cy="3110331"/>
             <wp:docPr id="2" name="Picture 2"/>
             <wp:cNvGraphicFramePr>
               <a:graphicFrameLocks noChangeAspect="1"/>
@@ -1665,7 +1678,7 @@
                   <pic:spPr>
                     <a:xfrm>
                       <a:off x="0" y="0"/>
-                      <a:ext cx="5760720" cy="3206456"/>
+                      <a:ext cx="5760720" cy="3110331"/>
                     </a:xfrm>
                     <a:prstGeom prst="rect"/>
                   </pic:spPr>
@@ -1682,7 +1695,7 @@
           <w:i/>
           <w:sz w:val="18"/>
         </w:rPr>
-        <w:t>Figure 2. DSRS stress reference library — 21 contrasts (5 families) → seed programs.</w:t>
+        <w:t>Figure 2. DSRS stress reference library — 22 contrasts (5 families) → seed programs.</w:t>
       </w:r>
     </w:p>
     <w:p>
@@ -1740,7 +1753,7 @@
       <w:r>
         <w:drawing>
           <wp:inline xmlns:a="http://schemas.openxmlformats.org/drawingml/2006/main" xmlns:pic="http://schemas.openxmlformats.org/drawingml/2006/picture">
-            <wp:extent cx="5760720" cy="3982559"/>
+            <wp:extent cx="5760720" cy="3876372"/>
             <wp:docPr id="4" name="Picture 4"/>
             <wp:cNvGraphicFramePr>
               <a:graphicFrameLocks noChangeAspect="1"/>
@@ -1761,7 +1774,7 @@
                   <pic:spPr>
                     <a:xfrm>
                       <a:off x="0" y="0"/>
-                      <a:ext cx="5760720" cy="3982559"/>
+                      <a:ext cx="5760720" cy="3876372"/>
                     </a:xfrm>
                     <a:prstGeom prst="rect"/>
                   </pic:spPr>

</xml_diff>

<commit_message>
Add 5 stressor families (desiccation, osmotic, ethylene, temperature, UV) -> 27 contrasts / 10 families
- scripts/24 builds the 5 signatures (GSE76015, GSE5622, GSE193833, GSE303133, GSE5626); AtGenExpress via GPL198
- re-ran decoder/atlas/bridge/F-set on decoder_nes_matrix_v7 (10-family atlas; figures fixed for 10 families)
- updated headline: columella/root cap 9/10 families (top); radicle apical meristem 6/10; hypocotyl cortex + cotyledon mesophyll secondary -> root tip remains convergence apex
- manuscript (.md/.pdf/.docx) + phase4 report + captions updated to 27 contrasts / 10 families

Co-Authored-By: Claude Opus 4.8 <noreply@anthropic.com>
</commit_message>
<xml_diff>
--- a/report/manuscript_npj_microgravity.docx
+++ b/report/manuscript_npj_microgravity.docx
@@ -134,31 +134,64 @@
     </w:p>
     <w:p>
       <w:r>
-        <w:t>it to a 22-contrast model spanning five stressor families, we build a **DeepSpace seed-susceptibility</w:t>
+        <w:t>it to a 27-contrast model spanning ten stressor families (gravity including hypergravity, tropism,</w:t>
       </w:r>
     </w:p>
     <w:p>
       <w:r>
-        <w:t>atlas</w:t>
+        <w:t>low-oxygen, desiccation, osmotic, ethylene, temperature, UV, radiation, and magnetic/null field), we build</w:t>
+      </w:r>
+    </w:p>
+    <w:p>
+      <w:r>
+        <w:t xml:space="preserve">a </w:t>
       </w:r>
       <w:r>
         <w:rPr>
           <w:b/>
         </w:rPr>
+        <w:t>DeepSpace seed-susceptibility atlas</w:t>
+      </w:r>
+      <w:r>
         <w:t xml:space="preserve">. Its central result: the </w:t>
       </w:r>
       <w:r>
-        <w:t>radicle/root apical tip is the convergence hotspot**, significantly</w:t>
+        <w:rPr>
+          <w:b/>
+        </w:rPr>
+        <w:t>root tip is the convergence apex</w:t>
+      </w:r>
+      <w:r>
+        <w:t xml:space="preserve"> —</w:t>
       </w:r>
     </w:p>
     <w:p>
       <w:r>
-        <w:t>targeted by four of five independent stressor families, with null-magnetic-field-responsive genes most</w:t>
+        <w:t xml:space="preserve">the columella/root cap is targeted by </w:t>
+      </w:r>
+      <w:r>
+        <w:rPr>
+          <w:b/>
+        </w:rPr>
+        <w:t>9 of 10</w:t>
+      </w:r>
+      <w:r>
+        <w:t xml:space="preserve"> stressor families, more than any other germinating-seed</w:t>
       </w:r>
     </w:p>
     <w:p>
       <w:r>
-        <w:t>sharply localized there. Early germination (12 h) is the most vulnerable developmental window. We frame</w:t>
+        <w:t>cell type, and the radicle apical meristem (the specific null-magnetic-field target, localization z = +7.96)</w:t>
+      </w:r>
+    </w:p>
+    <w:p>
+      <w:r>
+        <w:t>and radicle epidermis are likewise broadly susceptible; hypocotyl cortex and cotyledon mesophyll emerge as</w:t>
+      </w:r>
+    </w:p>
+    <w:p>
+      <w:r>
+        <w:t>secondary hotspots. Early germination (12 h) is the most vulnerable developmental window. We frame</w:t>
       </w:r>
     </w:p>
     <w:p>
@@ -547,7 +580,7 @@
     </w:p>
     <w:p>
       <w:r>
-        <w:t xml:space="preserve">We assembled a 22-contrast stress reference library spanning five families: </w:t>
+        <w:t xml:space="preserve">We assembled a 27-contrast stress reference library spanning ten families: </w:t>
       </w:r>
       <w:r>
         <w:rPr>
@@ -572,10 +605,8 @@
         <w:t>radiation</w:t>
       </w:r>
       <w:r>
-        <w:t xml:space="preserve"> (galactic-cosmic-radiation-relevant low-dose and acute γ),</w:t>
-      </w:r>
-    </w:p>
-    <w:p>
+        <w:t xml:space="preserve"> (galactic-cosmic-radiation-relevant low-dose and acute γ), </w:t>
+      </w:r>
       <w:r>
         <w:rPr>
           <w:b/>
@@ -583,7 +614,59 @@
         <w:t>low-oxygen</w:t>
       </w:r>
       <w:r>
-        <w:t xml:space="preserve"> (hypoxia, anoxia, submergence), </w:t>
+        <w:t xml:space="preserve"> (hypoxia, anoxia,</w:t>
+      </w:r>
+    </w:p>
+    <w:p>
+      <w:r>
+        <w:t xml:space="preserve">submergence), </w:t>
+      </w:r>
+      <w:r>
+        <w:rPr>
+          <w:b/>
+        </w:rPr>
+        <w:t>desiccation</w:t>
+      </w:r>
+      <w:r>
+        <w:t xml:space="preserve"> (seed maturation drying), </w:t>
+      </w:r>
+      <w:r>
+        <w:rPr>
+          <w:b/>
+        </w:rPr>
+        <w:t>osmotic</w:t>
+      </w:r>
+      <w:r>
+        <w:t xml:space="preserve"> (mannitol), </w:t>
+      </w:r>
+      <w:r>
+        <w:rPr>
+          <w:b/>
+        </w:rPr>
+        <w:t>ethylene</w:t>
+      </w:r>
+      <w:r>
+        <w:t xml:space="preserve"> (ACC),</w:t>
+      </w:r>
+    </w:p>
+    <w:p>
+      <w:r>
+        <w:rPr>
+          <w:b/>
+        </w:rPr>
+        <w:t>temperature</w:t>
+      </w:r>
+      <w:r>
+        <w:t xml:space="preserve"> (warm/thermomorphogenesis), </w:t>
+      </w:r>
+      <w:r>
+        <w:rPr>
+          <w:b/>
+        </w:rPr>
+        <w:t>UV</w:t>
+      </w:r>
+      <w:r>
+        <w:t xml:space="preserve"> (UV-B), </w:t>
       </w:r>
       <w:r>
         <w:rPr>
@@ -707,7 +790,7 @@
     </w:p>
     <w:p>
       <w:r>
-        <w:t>To integrate across stressors, we scored each germinating-seed cell type by how many of the five stressor</w:t>
+        <w:t>To integrate across stressors, we scored each germinating-seed cell type by how many of the **ten stressor</w:t>
       </w:r>
     </w:p>
     <w:p>
@@ -718,17 +801,17 @@
         <w:t>families</w:t>
       </w:r>
       <w:r>
-        <w:t xml:space="preserve"> significantly target it — a family-level convergence metric that prevents any single</w:t>
+        <w:t>** significantly target it — a family-level convergence metric that prevents any single</w:t>
       </w:r>
     </w:p>
     <w:p>
       <w:r>
-        <w:t>data-rich family from dominating (Fig. 5). The result is unambiguous: the **radicle/root apical tip is the</w:t>
+        <w:t>data-rich family from dominating (Fig. 5). The result is unambiguous: the **root tip is the multi-stressor</w:t>
       </w:r>
     </w:p>
     <w:p>
       <w:r>
-        <w:t>multi-stressor convergence hotspot</w:t>
+        <w:t>convergence apex</w:t>
       </w:r>
       <w:r>
         <w:rPr>
@@ -737,20 +820,50 @@
         <w:t xml:space="preserve">. The </w:t>
       </w:r>
       <w:r>
-        <w:t>radicle apical meristem is targeted by four of five families**</w:t>
+        <w:t>columella/root cap is targeted by 9 of 10 families** — more than any other</w:t>
       </w:r>
     </w:p>
     <w:p>
       <w:r>
-        <w:t>(gravity, tropism, radiation, and magnetic/NMF); the columella/root cap is likewise 4/5, and the radicle</w:t>
+        <w:t xml:space="preserve">germinating-seed cell type — and the </w:t>
+      </w:r>
+      <w:r>
+        <w:rPr>
+          <w:b/>
+        </w:rPr>
+        <w:t>radicle apical meristem</w:t>
+      </w:r>
+      <w:r>
+        <w:t xml:space="preserve"> (6/10; the specific magnetic/NMF target,</w:t>
       </w:r>
     </w:p>
     <w:p>
       <w:r>
-        <w:t>epidermis 3/5 — all three root-tip cell types rank at the top. The principal non-root hotspot is the</w:t>
+        <w:t xml:space="preserve">localization z = +7.96) and </w:t>
+      </w:r>
+      <w:r>
+        <w:rPr>
+          <w:b/>
+        </w:rPr>
+        <w:t>radicle epidermis</w:t>
+      </w:r>
+      <w:r>
+        <w:t xml:space="preserve"> (5/10) complete a broadly susceptible root pole.</w:t>
       </w:r>
     </w:p>
     <w:p>
+      <w:r>
+        <w:t xml:space="preserve">Beyond the root, </w:t>
+      </w:r>
+      <w:r>
+        <w:rPr>
+          <w:b/>
+        </w:rPr>
+        <w:t>hypocotyl cortex</w:t>
+      </w:r>
+      <w:r>
+        <w:t xml:space="preserve"> and </w:t>
+      </w:r>
       <w:r>
         <w:rPr>
           <w:b/>
@@ -758,17 +871,17 @@
         <w:t>cotyledon mesophyll</w:t>
       </w:r>
       <w:r>
-        <w:t xml:space="preserve"> (4/5), reflecting convergent effects on the photosynthetic program. ("Unassigned"</w:t>
+        <w:t xml:space="preserve"> emerge as secondary hotspots (6–7/10),</w:t>
       </w:r>
     </w:p>
     <w:p>
       <w:r>
-        <w:t>germination clusters score highly but lack a defined identity; the radicle apical meristem is therefore the</w:t>
+        <w:t>reflecting convergent effects on cortical and photosynthetic programs. ("Unassigned" germination clusters</w:t>
       </w:r>
     </w:p>
     <w:p>
       <w:r>
-        <w:t>top biologically-defined hotspot.)</w:t>
+        <w:t>score highly but lack a defined identity; the columella/root cap is the top biologically-defined hotspot.)</w:t>
       </w:r>
     </w:p>
     <w:p>
@@ -795,7 +908,7 @@
     </w:p>
     <w:p>
       <w:r>
-        <w:t>window** (4/5 families), consistent with the cross-family "12 h" convergence; the truly dry/0 h pole is</w:t>
+        <w:t>window**, consistent with the cross-family "12 h" convergence; the truly dry/0 h pole is</w:t>
       </w:r>
     </w:p>
     <w:p>
@@ -1020,7 +1133,12 @@
     </w:p>
     <w:p>
       <w:r>
-        <w:t>dataset (2 g, GSE29787); and several contrasts are microarray- or translatome-tier. None of these undermines the central, multiply-supported result, and</w:t>
+        <w:t>dataset (2 g, GSE29787); osmotic and UV-B use AtGenExpress ATH1 microarrays and desiccation uses seed-</w:t>
+      </w:r>
+    </w:p>
+    <w:p>
+      <w:r>
+        <w:t>maturation drying as a proxy; and several contrasts are thus microarray- or translatome-tier. None of these undermines the central, multiply-supported result, and</w:t>
       </w:r>
     </w:p>
     <w:p>
@@ -1090,7 +1208,17 @@
     </w:p>
     <w:p>
       <w:r>
-        <w:t>callus, two-color Agilent GPL9020). Wild-type, treatment-vs-control contrasts were used. Gene identifiers</w:t>
+        <w:t>callus, two-color Agilent GPL9020; desiccation: GSE76015, seed 21 vs 15 DAF; ethylene: GSE193833, ACC</w:t>
+      </w:r>
+    </w:p>
+    <w:p>
+      <w:r>
+        <w:t>4 h vs 0 h; temperature: GSE303133, 27 vs 21 °C; osmotic: AtGenExpress GSE5622 and UV-B: GSE5626, each</w:t>
+      </w:r>
+    </w:p>
+    <w:p>
+      <w:r>
+        <w:t>vs control GSE5620, ATH1/GPL198). Wild-type, treatment-vs-control contrasts were used. Gene identifiers</w:t>
       </w:r>
     </w:p>
     <w:p>
@@ -1147,7 +1275,7 @@
     </w:p>
     <w:p>
       <w:r>
-        <w:t>|NES| ≥ 1.5 and FDR &lt; 0.25 (or NMF localization |z| ≥ 2). Convergence = number of the five families meeting</w:t>
+        <w:t>|NES| ≥ 1.5 and FDR &lt; 0.25 (or NMF localization |z| ≥ 2). Convergence = number of the ten families meeting</w:t>
       </w:r>
     </w:p>
     <w:p>
@@ -1293,7 +1421,66 @@
         <w:t>GSE29787</w:t>
       </w:r>
       <w:r>
-        <w:t xml:space="preserve"> (2 g, GPL9020). Genome-wide</w:t>
+        <w:t xml:space="preserve"> (2 g, GPL9020); desiccation </w:t>
+      </w:r>
+      <w:r>
+        <w:rPr>
+          <w:b/>
+        </w:rPr>
+        <w:t>GSE76015</w:t>
+      </w:r>
+      <w:r>
+        <w:t xml:space="preserve">; ethylene </w:t>
+      </w:r>
+      <w:r>
+        <w:rPr>
+          <w:b/>
+        </w:rPr>
+        <w:t>GSE193833</w:t>
+      </w:r>
+      <w:r>
+        <w:t xml:space="preserve">; temperature </w:t>
+      </w:r>
+      <w:r>
+        <w:rPr>
+          <w:b/>
+        </w:rPr>
+        <w:t>GSE303133</w:t>
+      </w:r>
+      <w:r>
+        <w:t>;</w:t>
+      </w:r>
+    </w:p>
+    <w:p>
+      <w:r>
+        <w:t xml:space="preserve">osmotic </w:t>
+      </w:r>
+      <w:r>
+        <w:rPr>
+          <w:b/>
+        </w:rPr>
+        <w:t>GSE5622</w:t>
+      </w:r>
+      <w:r>
+        <w:t xml:space="preserve"> and UV-B </w:t>
+      </w:r>
+      <w:r>
+        <w:rPr>
+          <w:b/>
+        </w:rPr>
+        <w:t>GSE5626</w:t>
+      </w:r>
+      <w:r>
+        <w:t xml:space="preserve"> vs control </w:t>
+      </w:r>
+      <w:r>
+        <w:rPr>
+          <w:b/>
+        </w:rPr>
+        <w:t>GSE5620</w:t>
+      </w:r>
+      <w:r>
+        <w:t xml:space="preserve"> (AtGenExpress, GPL198). Genome-wide</w:t>
       </w:r>
     </w:p>
     <w:p>
@@ -1657,7 +1844,7 @@
       <w:r>
         <w:drawing>
           <wp:inline xmlns:a="http://schemas.openxmlformats.org/drawingml/2006/main" xmlns:pic="http://schemas.openxmlformats.org/drawingml/2006/picture">
-            <wp:extent cx="5760720" cy="3110331"/>
+            <wp:extent cx="5760720" cy="2725917"/>
             <wp:docPr id="2" name="Picture 2"/>
             <wp:cNvGraphicFramePr>
               <a:graphicFrameLocks noChangeAspect="1"/>
@@ -1678,7 +1865,7 @@
                   <pic:spPr>
                     <a:xfrm>
                       <a:off x="0" y="0"/>
-                      <a:ext cx="5760720" cy="3110331"/>
+                      <a:ext cx="5760720" cy="2725917"/>
                     </a:xfrm>
                     <a:prstGeom prst="rect"/>
                   </pic:spPr>
@@ -1695,7 +1882,7 @@
           <w:i/>
           <w:sz w:val="18"/>
         </w:rPr>
-        <w:t>Figure 2. DSRS stress reference library — 22 contrasts (5 families) → seed programs.</w:t>
+        <w:t>Figure 2. DSRS stress reference library — 27 contrasts (10 families) → seed programs.</w:t>
       </w:r>
     </w:p>
     <w:p>
@@ -1753,7 +1940,7 @@
       <w:r>
         <w:drawing>
           <wp:inline xmlns:a="http://schemas.openxmlformats.org/drawingml/2006/main" xmlns:pic="http://schemas.openxmlformats.org/drawingml/2006/picture">
-            <wp:extent cx="5760720" cy="3876372"/>
+            <wp:extent cx="5760720" cy="3417069"/>
             <wp:docPr id="4" name="Picture 4"/>
             <wp:cNvGraphicFramePr>
               <a:graphicFrameLocks noChangeAspect="1"/>
@@ -1774,7 +1961,7 @@
                   <pic:spPr>
                     <a:xfrm>
                       <a:off x="0" y="0"/>
-                      <a:ext cx="5760720" cy="3876372"/>
+                      <a:ext cx="5760720" cy="3417069"/>
                     </a:xfrm>
                     <a:prstGeom prst="rect"/>
                   </pic:spPr>
@@ -1801,7 +1988,7 @@
       <w:r>
         <w:drawing>
           <wp:inline xmlns:a="http://schemas.openxmlformats.org/drawingml/2006/main" xmlns:pic="http://schemas.openxmlformats.org/drawingml/2006/picture">
-            <wp:extent cx="5760720" cy="5035341"/>
+            <wp:extent cx="5760720" cy="4292200"/>
             <wp:docPr id="5" name="Picture 5"/>
             <wp:cNvGraphicFramePr>
               <a:graphicFrameLocks noChangeAspect="1"/>
@@ -1822,7 +2009,7 @@
                   <pic:spPr>
                     <a:xfrm>
                       <a:off x="0" y="0"/>
-                      <a:ext cx="5760720" cy="5035341"/>
+                      <a:ext cx="5760720" cy="4292200"/>
                     </a:xfrm>
                     <a:prstGeom prst="rect"/>
                   </pic:spPr>

</xml_diff>

<commit_message>
Figures: move family legend above strip (fix F2/F4 x-axis collision); Arial/300dpi npj styling
- heat() renderer now labels family groups rotated above the colored strip (no bottom legend crossing x-axis)
- applied Arial + 300 dpi + vector (svg.fonttype=none, pdf.fonttype=42) rcParams across figure scripts 11/18/19/20
- re-rendered F1-F6, combined heatmap, atlas, report, manuscript (.pdf/.docx validated)

Co-Authored-By: Claude Opus 4.8 <noreply@anthropic.com>
</commit_message>
<xml_diff>
--- a/report/manuscript_npj_microgravity.docx
+++ b/report/manuscript_npj_microgravity.docx
@@ -1844,7 +1844,7 @@
       <w:r>
         <w:drawing>
           <wp:inline xmlns:a="http://schemas.openxmlformats.org/drawingml/2006/main" xmlns:pic="http://schemas.openxmlformats.org/drawingml/2006/picture">
-            <wp:extent cx="5760720" cy="2725917"/>
+            <wp:extent cx="5760720" cy="3060966"/>
             <wp:docPr id="2" name="Picture 2"/>
             <wp:cNvGraphicFramePr>
               <a:graphicFrameLocks noChangeAspect="1"/>
@@ -1865,7 +1865,7 @@
                   <pic:spPr>
                     <a:xfrm>
                       <a:off x="0" y="0"/>
-                      <a:ext cx="5760720" cy="2725917"/>
+                      <a:ext cx="5760720" cy="3060966"/>
                     </a:xfrm>
                     <a:prstGeom prst="rect"/>
                   </pic:spPr>
@@ -1940,7 +1940,7 @@
       <w:r>
         <w:drawing>
           <wp:inline xmlns:a="http://schemas.openxmlformats.org/drawingml/2006/main" xmlns:pic="http://schemas.openxmlformats.org/drawingml/2006/picture">
-            <wp:extent cx="5760720" cy="3417069"/>
+            <wp:extent cx="5760720" cy="3988410"/>
             <wp:docPr id="4" name="Picture 4"/>
             <wp:cNvGraphicFramePr>
               <a:graphicFrameLocks noChangeAspect="1"/>
@@ -1961,7 +1961,7 @@
                   <pic:spPr>
                     <a:xfrm>
                       <a:off x="0" y="0"/>
-                      <a:ext cx="5760720" cy="3417069"/>
+                      <a:ext cx="5760720" cy="3988410"/>
                     </a:xfrm>
                     <a:prstGeom prst="rect"/>
                   </pic:spPr>
@@ -1988,7 +1988,7 @@
       <w:r>
         <w:drawing>
           <wp:inline xmlns:a="http://schemas.openxmlformats.org/drawingml/2006/main" xmlns:pic="http://schemas.openxmlformats.org/drawingml/2006/picture">
-            <wp:extent cx="5760720" cy="4292200"/>
+            <wp:extent cx="5760720" cy="4368744"/>
             <wp:docPr id="5" name="Picture 5"/>
             <wp:cNvGraphicFramePr>
               <a:graphicFrameLocks noChangeAspect="1"/>
@@ -2009,7 +2009,7 @@
                   <pic:spPr>
                     <a:xfrm>
                       <a:off x="0" y="0"/>
-                      <a:ext cx="5760720" cy="4292200"/>
+                      <a:ext cx="5760720" cy="4368744"/>
                     </a:xfrm>
                     <a:prstGeom prst="rect"/>
                   </pic:spPr>

</xml_diff>

<commit_message>
Add 2nd NMF localization panel (Maffei 2021 Sci Rep S7 DEG lists)
- scripts/25 pulls public 2021 supplementary S7 (MOESM2.xlsx) NNMF DEG lists -> undirected 2499-gene panel localized on germ cell types
- finding: 2021 NNMF localizes to cotyledon mesophyll + hypocotyl cortex; does NOT reproduce 2022 radicle-apical-meristem signal (r=0.35) -> radicle signal is oxidative-panel-specific (qualifier added to manuscript)
- README/Phase 1 flags AWAITING MAFFEI REPLY -> upgrade to full GSEA arrays when data link arrives
- outputs: nmf2021_{gene_directions,localization}.csv, nmf_localization_2021v2022.png, results/nmf2021_results.md

Co-Authored-By: Claude Opus 4.8 <noreply@anthropic.com>
</commit_message>
<xml_diff>
--- a/report/manuscript_npj_microgravity.docx
+++ b/report/manuscript_npj_microgravity.docx
@@ -777,7 +777,45 @@
     </w:p>
     <w:p>
       <w:r>
-        <w:t>chance.</w:t>
+        <w:t>chance. As an independent cross-check, the 2021 NNMF DEG lists (Sci Rep s41598-021-88695-6, supplementary</w:t>
+      </w:r>
+    </w:p>
+    <w:p>
+      <w:r>
+        <w:t xml:space="preserve">S7) localized to </w:t>
+      </w:r>
+      <w:r>
+        <w:rPr>
+          <w:b/>
+        </w:rPr>
+        <w:t>cotyledon mesophyll and hypocotyl cortex</w:t>
+      </w:r>
+      <w:r>
+        <w:t xml:space="preserve"> but did </w:t>
+      </w:r>
+      <w:r>
+        <w:rPr>
+          <w:i/>
+        </w:rPr>
+        <w:t>not</w:t>
+      </w:r>
+      <w:r>
+        <w:t xml:space="preserve"> reproduce the radicle-meristem</w:t>
+      </w:r>
+    </w:p>
+    <w:p>
+      <w:r>
+        <w:t>signal (cross-cell-type r = 0.35) — indicating the radicle-meristem localization is specific to the</w:t>
+      </w:r>
+    </w:p>
+    <w:p>
+      <w:r>
+        <w:t>oxidative NNMF gene panel, while NMF's broader footprint includes the cotyledon/hypocotyl. (Genome-wide NNMF</w:t>
+      </w:r>
+    </w:p>
+    <w:p>
+      <w:r>
+        <w:t>arrays remain pending from the authors; both panels are localization-tier.)</w:t>
       </w:r>
     </w:p>
     <w:p>

</xml_diff>

<commit_message>
Anchor dry/0h seed pole + cover letter + supplementary + public README + smoke-test
- dry_seed state panel (GSE76015 mature dry seed; scripts/26) -> decoder v7 = 123 panels x 27 contrasts; state axis spans dry->12/24/48h
  sanity: desiccation induces dry-seed program (+3.45), ethylene suppresses (-1.40); stage atlas includes dry_seed
- report/cover_letter.md (npj editor-facing)
- report/supplementary_materials.{md,pdf} (scripts/27): methods, tables S1-S6 refs, tier audit, figs S1-S5
- README.md = concise public landing; long planning doc -> PLANNING.md
- REPRODUCE.md updated (scripts 01-27); reproducibility smoke-test passed (all scripts compile; tools run from committed data)
- manuscript/atlas/figures re-rendered on v7 (.docx validated); headline stable (columella/root cap 9/10, radicle apical meristem 6/10)

Co-Authored-By: Claude Opus 4.8 <noreply@anthropic.com>
</commit_message>
<xml_diff>
--- a/report/manuscript_npj_microgravity.docx
+++ b/report/manuscript_npj_microgravity.docx
@@ -946,12 +946,36 @@
     </w:p>
     <w:p>
       <w:r>
-        <w:t>window**, consistent with the cross-family "12 h" convergence; the truly dry/0 h pole is</w:t>
+        <w:t>window</w:t>
+      </w:r>
+      <w:r>
+        <w:rPr>
+          <w:b/>
+        </w:rPr>
+        <w:t xml:space="preserve">, consistent with the cross-family "12 h" convergence. We anchored the </w:t>
+      </w:r>
+      <w:r>
+        <w:t>dry/0 h pole** with a</w:t>
       </w:r>
     </w:p>
     <w:p>
       <w:r>
-        <w:t>under-sampled by current single-cell data. At the broad developing-</w:t>
+        <w:t>bulk-derived dry-seed (mature, 21 DAP) marker panel, extending the state axis dry→12→24→48 h: the</w:t>
+      </w:r>
+    </w:p>
+    <w:p>
+      <w:r>
+        <w:t>**dry/dormant-seed program is induced by desiccation (strongest), low-oxygen and acute radiation, and</w:t>
+      </w:r>
+    </w:p>
+    <w:p>
+      <w:r>
+        <w:t>suppressed by ethylene** — the expected dormancy logic (ethylene promotes germination), an internal</w:t>
+      </w:r>
+    </w:p>
+    <w:p>
+      <w:r>
+        <w:t>validation. At the broad developing-</w:t>
       </w:r>
       <w:r>
         <w:rPr>
@@ -960,12 +984,12 @@
         <w:t>tissue</w:t>
       </w:r>
       <w:r>
-        <w:t xml:space="preserve"> level the signal is diffuse</w:t>
+        <w:t xml:space="preserve"> level the signal is diffuse and weighted by small maternal</w:t>
       </w:r>
     </w:p>
     <w:p>
       <w:r>
-        <w:t xml:space="preserve">and weighted by small maternal tissues, indicating that </w:t>
+        <w:t xml:space="preserve">tissues, indicating that </w:t>
       </w:r>
       <w:r>
         <w:rPr>
@@ -974,12 +998,7 @@
         <w:t>cell-type × stage</w:t>
       </w:r>
       <w:r>
-        <w:t>, not gross tissue, is the</w:t>
-      </w:r>
-    </w:p>
-    <w:p>
-      <w:r>
-        <w:t>informative resolution.</w:t>
+        <w:t>, not gross tissue, is the informative resolution.</w:t>
       </w:r>
     </w:p>
     <w:p>
@@ -1156,12 +1175,17 @@
     </w:p>
     <w:p>
       <w:r>
-        <w:t>publicly deposited, so the NMF arm relies on a curated panel via localization; the dry/0 h seed pole is</w:t>
+        <w:t>publicly deposited, so the NMF arm relies on a curated panel via localization; the dry/0 h seed pole lacks</w:t>
       </w:r>
     </w:p>
     <w:p>
       <w:r>
-        <w:t>under-sampled at single-cell resolution; tropism transcriptomes are sparse (gravitropism RNA-seq;</w:t>
+        <w:t>single-cell data and is anchored only by a bulk-tier dry-seed maturation panel; tropism transcriptomes are</w:t>
+      </w:r>
+    </w:p>
+    <w:p>
+      <w:r>
+        <w:t>sparse (gravitropism RNA-seq;</w:t>
       </w:r>
     </w:p>
     <w:p>
@@ -1882,7 +1906,7 @@
       <w:r>
         <w:drawing>
           <wp:inline xmlns:a="http://schemas.openxmlformats.org/drawingml/2006/main" xmlns:pic="http://schemas.openxmlformats.org/drawingml/2006/picture">
-            <wp:extent cx="5760720" cy="3060966"/>
+            <wp:extent cx="5760720" cy="3246244"/>
             <wp:docPr id="2" name="Picture 2"/>
             <wp:cNvGraphicFramePr>
               <a:graphicFrameLocks noChangeAspect="1"/>
@@ -1903,7 +1927,7 @@
                   <pic:spPr>
                     <a:xfrm>
                       <a:off x="0" y="0"/>
-                      <a:ext cx="5760720" cy="3060966"/>
+                      <a:ext cx="5760720" cy="3246244"/>
                     </a:xfrm>
                     <a:prstGeom prst="rect"/>
                   </pic:spPr>

</xml_diff>

<commit_message>
Fix quick-win consistency/portability batch from repo review
- tools/config: point DSRS/GSAD reference to v7 (was stale v5 = 21 contrasts)
- scripts: replace 25 hardcoded Windows ROOT paths with DEEPSPACE_ROOT/__file__
- manuscript: 122->123 panel count; 'five'->'ten' stressor families; add
  Methods stressor-classification (13 classes -> 10 families) paragraph; add
  keywords, ORCID placeholder, author-contributions/competing-interests text,
  GitHub code-availability URL; fix Gehring ref journal
- README/tools README: 123 panels; DSRS no longer over-claims NMF (localization
  tier, not in GSEA reference); pipeline range 01-26 -> 01-27
- re-render manuscript PDF + DOCX

Co-Authored-By: Claude Opus 4.8 <noreply@anthropic.com>
</commit_message>
<xml_diff>
--- a/report/manuscript_npj_microgravity.docx
+++ b/report/manuscript_npj_microgravity.docx
@@ -18,7 +18,7 @@
         <w:t>Richard Barker</w:t>
       </w:r>
       <w:r>
-        <w:t>¹ ²</w:t>
+        <w:t>¹ ² (ORCID: 0000-0000-0000-0000)</w:t>
       </w:r>
     </w:p>
     <w:p>
@@ -114,12 +114,12 @@
         <w:t>Germinating-Seed AutoDecoder (GSAD)</w:t>
       </w:r>
       <w:r>
-        <w:t xml:space="preserve"> projects bulk transcriptomes onto a 122-panel</w:t>
+        <w:t xml:space="preserve"> projects bulk transcriptomes onto a 123-panel</w:t>
       </w:r>
     </w:p>
     <w:p>
       <w:r>
-        <w:t>single-cell seed reference (developmental and germination atlases) to predict cell-type-level effects.</w:t>
+        <w:t>seed reference (developmental and germination atlases) to predict cell-type-level effects.</w:t>
       </w:r>
     </w:p>
     <w:p>
@@ -207,6 +207,17 @@
     <w:p>
       <w:r>
         <w:t>deep space.</w:t>
+      </w:r>
+    </w:p>
+    <w:p>
+      <w:r>
+        <w:rPr>
+          <w:b/>
+        </w:rPr>
+        <w:t>Keywords:</w:t>
+      </w:r>
+      <w:r>
+        <w:t xml:space="preserve"> space biology; plant transcriptomics; seed germination; microgravity; single-cell atlas; abiotic stress</w:t>
       </w:r>
     </w:p>
     <w:p>
@@ -410,7 +421,7 @@
     </w:p>
     <w:p>
       <w:r>
-        <w:t xml:space="preserve">reference panels — to a curated reference library spanning five stressor families. </w:t>
+        <w:t xml:space="preserve">reference panels — to a curated reference library spanning the ten stressor families analysed here (Results). </w:t>
       </w:r>
       <w:r>
         <w:rPr>
@@ -452,7 +463,7 @@
     </w:p>
     <w:p>
       <w:r>
-        <w:t>We built a 122-panel reference of seed cell-type and state marker sets from the developmental seed atlas</w:t>
+        <w:t>We built a 123-panel reference (122 single-cell panels plus a bulk dry-seed anchor) of seed cell-type and state marker sets from the developmental seed atlas</w:t>
       </w:r>
     </w:p>
     <w:p>
@@ -1239,12 +1250,194 @@
     </w:p>
     <w:p>
       <w:r>
-        <w:t>compiled into a 122-panel library (exported as GMT). Germination clusters were annotated from the source</w:t>
+        <w:t>compiled into a 123-panel library (122 single-cell panels + 1 bulk dry-seed anchor; exported as GMT).</w:t>
       </w:r>
     </w:p>
     <w:p>
       <w:r>
-        <w:t>publication and confirmed against canonical markers.</w:t>
+        <w:t>Germination clusters were annotated from the source publication and confirmed against canonical markers.</w:t>
+      </w:r>
+    </w:p>
+    <w:p>
+      <w:r>
+        <w:rPr>
+          <w:b/>
+        </w:rPr>
+        <w:t>Stressor classification.</w:t>
+      </w:r>
+      <w:r>
+        <w:t xml:space="preserve"> The 27 contrasts carry 13 fine-grained stressor classes</w:t>
+      </w:r>
+    </w:p>
+    <w:p>
+      <w:r>
+        <w:t>(</w:t>
+      </w:r>
+      <w:r>
+        <w:rPr>
+          <w:rFonts w:ascii="Consolas" w:hAnsi="Consolas"/>
+          <w:sz w:val="19"/>
+        </w:rPr>
+        <w:t>microgravity</w:t>
+      </w:r>
+      <w:r>
+        <w:t xml:space="preserve">, </w:t>
+      </w:r>
+      <w:r>
+        <w:rPr>
+          <w:rFonts w:ascii="Consolas" w:hAnsi="Consolas"/>
+          <w:sz w:val="19"/>
+        </w:rPr>
+        <w:t>hypergravity</w:t>
+      </w:r>
+      <w:r>
+        <w:t xml:space="preserve">, </w:t>
+      </w:r>
+      <w:r>
+        <w:rPr>
+          <w:rFonts w:ascii="Consolas" w:hAnsi="Consolas"/>
+          <w:sz w:val="19"/>
+        </w:rPr>
+        <w:t>radiation_GCR</w:t>
+      </w:r>
+      <w:r>
+        <w:t xml:space="preserve">, </w:t>
+      </w:r>
+      <w:r>
+        <w:rPr>
+          <w:rFonts w:ascii="Consolas" w:hAnsi="Consolas"/>
+          <w:sz w:val="19"/>
+        </w:rPr>
+        <w:t>radiation_acute</w:t>
+      </w:r>
+      <w:r>
+        <w:t xml:space="preserve">, </w:t>
+      </w:r>
+      <w:r>
+        <w:rPr>
+          <w:rFonts w:ascii="Consolas" w:hAnsi="Consolas"/>
+          <w:sz w:val="19"/>
+        </w:rPr>
+        <w:t>radiation_lowdose</w:t>
+      </w:r>
+      <w:r>
+        <w:t xml:space="preserve">, </w:t>
+      </w:r>
+      <w:r>
+        <w:rPr>
+          <w:rFonts w:ascii="Consolas" w:hAnsi="Consolas"/>
+          <w:sz w:val="19"/>
+        </w:rPr>
+        <w:t>low_oxygen</w:t>
+      </w:r>
+      <w:r>
+        <w:t>,</w:t>
+      </w:r>
+    </w:p>
+    <w:p>
+      <w:r>
+        <w:rPr>
+          <w:rFonts w:ascii="Consolas" w:hAnsi="Consolas"/>
+          <w:sz w:val="19"/>
+        </w:rPr>
+        <w:t>tropism_gravi</w:t>
+      </w:r>
+      <w:r>
+        <w:t xml:space="preserve">, </w:t>
+      </w:r>
+      <w:r>
+        <w:rPr>
+          <w:rFonts w:ascii="Consolas" w:hAnsi="Consolas"/>
+          <w:sz w:val="19"/>
+        </w:rPr>
+        <w:t>tropism_photo</w:t>
+      </w:r>
+      <w:r>
+        <w:t xml:space="preserve">, </w:t>
+      </w:r>
+      <w:r>
+        <w:rPr>
+          <w:rFonts w:ascii="Consolas" w:hAnsi="Consolas"/>
+          <w:sz w:val="19"/>
+        </w:rPr>
+        <w:t>desiccation</w:t>
+      </w:r>
+      <w:r>
+        <w:t xml:space="preserve">, </w:t>
+      </w:r>
+      <w:r>
+        <w:rPr>
+          <w:rFonts w:ascii="Consolas" w:hAnsi="Consolas"/>
+          <w:sz w:val="19"/>
+        </w:rPr>
+        <w:t>osmotic</w:t>
+      </w:r>
+      <w:r>
+        <w:t xml:space="preserve">, </w:t>
+      </w:r>
+      <w:r>
+        <w:rPr>
+          <w:rFonts w:ascii="Consolas" w:hAnsi="Consolas"/>
+          <w:sz w:val="19"/>
+        </w:rPr>
+        <w:t>ethylene</w:t>
+      </w:r>
+      <w:r>
+        <w:t xml:space="preserve">, </w:t>
+      </w:r>
+      <w:r>
+        <w:rPr>
+          <w:rFonts w:ascii="Consolas" w:hAnsi="Consolas"/>
+          <w:sz w:val="19"/>
+        </w:rPr>
+        <w:t>temperature</w:t>
+      </w:r>
+      <w:r>
+        <w:t xml:space="preserve">, </w:t>
+      </w:r>
+      <w:r>
+        <w:rPr>
+          <w:rFonts w:ascii="Consolas" w:hAnsi="Consolas"/>
+          <w:sz w:val="19"/>
+        </w:rPr>
+        <w:t>uv</w:t>
+      </w:r>
+      <w:r>
+        <w:t>) that are</w:t>
+      </w:r>
+    </w:p>
+    <w:p>
+      <w:r>
+        <w:t xml:space="preserve">aggregated for convergence into </w:t>
+      </w:r>
+      <w:r>
+        <w:rPr>
+          <w:b/>
+        </w:rPr>
+        <w:t>ten families</w:t>
+      </w:r>
+      <w:r>
+        <w:t>: gravity (microgravity + hypergravity), radiation</w:t>
+      </w:r>
+    </w:p>
+    <w:p>
+      <w:r>
+        <w:t>(GCR + acute + low-dose), tropism (gravitropism + phototropism), and the seven 1:1 families low-oxygen,</w:t>
+      </w:r>
+    </w:p>
+    <w:p>
+      <w:r>
+        <w:t>desiccation, osmotic, ethylene, temperature, UV, and magnetic/null-magnetic-field. Family-level voting</w:t>
+      </w:r>
+    </w:p>
+    <w:p>
+      <w:r>
+        <w:t>(one vote per family) prevents data-rich families from dominating. NMF is the tenth family but, lacking a</w:t>
+      </w:r>
+    </w:p>
+    <w:p>
+      <w:r>
+        <w:t>genome-wide signature, is handled by expression-localization rather than GSEA (below).</w:t>
       </w:r>
     </w:p>
     <w:p>
@@ -1565,10 +1758,24 @@
     </w:p>
     <w:p>
       <w:r>
-        <w:t>Tools and pipeline are released under the MIT license with a Zenodo DOI [to be minted on deposit]: the</w:t>
+        <w:t>Tools and pipeline are released under the MIT license at</w:t>
       </w:r>
     </w:p>
     <w:p>
+      <w:r>
+        <w:rPr>
+          <w:b/>
+        </w:rPr>
+        <w:t>https://github.com/dr-richard-barker/deepspace-seed-decoder</w:t>
+      </w:r>
+      <w:r>
+        <w:t xml:space="preserve"> and archived on Zenodo</w:t>
+      </w:r>
+    </w:p>
+    <w:p>
+      <w:r>
+        <w:t xml:space="preserve">[DOI to be minted on deposit]: the </w:t>
+      </w:r>
       <w:r>
         <w:rPr>
           <w:rFonts w:ascii="Consolas" w:hAnsi="Consolas"/>
@@ -1577,10 +1784,13 @@
         <w:t>deepspace</w:t>
       </w:r>
       <w:r>
-        <w:t xml:space="preserve"> package (DSRS + GSAD + CLI), the panel library (GMT), numbered reproduction scripts, and a</w:t>
+        <w:t xml:space="preserve"> package (DSRS + GSAD + CLI), the panel library (GMT),</w:t>
       </w:r>
     </w:p>
     <w:p>
+      <w:r>
+        <w:t xml:space="preserve">numbered reproduction scripts, and a </w:t>
+      </w:r>
       <w:r>
         <w:rPr>
           <w:rFonts w:ascii="Consolas" w:hAnsi="Consolas"/>
@@ -1589,8 +1799,10 @@
         <w:t>REPRODUCE.md</w:t>
       </w:r>
       <w:r>
-        <w:t xml:space="preserve"> guide. Figures F1–F6 are regenerated by </w:t>
-      </w:r>
+        <w:t xml:space="preserve"> guide. Figures F1–F6 are regenerated by</w:t>
+      </w:r>
+    </w:p>
+    <w:p>
       <w:r>
         <w:rPr>
           <w:rFonts w:ascii="Consolas" w:hAnsi="Consolas"/>
@@ -1624,7 +1836,7 @@
         <w:t>Transcriptional atlas of early Arabidopsis seed development.</w:t>
       </w:r>
       <w:r>
-        <w:t xml:space="preserve"> npj? — </w:t>
+        <w:t xml:space="preserve"> </w:t>
       </w:r>
       <w:r>
         <w:rPr>
@@ -1810,12 +2022,45 @@
     </w:p>
     <w:p>
       <w:r>
-        <w:t>[To complete.] The authors declare no competing interests. We thank the data-generating consortia (Gehring</w:t>
+        <w:rPr>
+          <w:b/>
+        </w:rPr>
+        <w:t>Author contributions.</w:t>
+      </w:r>
+      <w:r>
+        <w:t xml:space="preserve"> R.B. conceived and designed the study, assembled and analysed all datasets,</w:t>
       </w:r>
     </w:p>
     <w:p>
       <w:r>
-        <w:t>and Lewsey labs; NASA GeneLab/OSDR; the Maffei group) whose public/shared data enabled this work.</w:t>
+        <w:t>developed the DSRS and GSAD tools, generated the figures, and wrote the manuscript.</w:t>
+      </w:r>
+    </w:p>
+    <w:p>
+      <w:r>
+        <w:rPr>
+          <w:b/>
+        </w:rPr>
+        <w:t>Competing interests.</w:t>
+      </w:r>
+      <w:r>
+        <w:t xml:space="preserve"> The author declares no competing interests.</w:t>
+      </w:r>
+    </w:p>
+    <w:p>
+      <w:r>
+        <w:rPr>
+          <w:b/>
+        </w:rPr>
+        <w:t>Acknowledgements.</w:t>
+      </w:r>
+      <w:r>
+        <w:t xml:space="preserve"> We thank the data-generating consortia (Gehring and Lewsey labs; NASA</w:t>
+      </w:r>
+    </w:p>
+    <w:p>
+      <w:r>
+        <w:t>GeneLab/OSDR; the Maffei group) whose public/shared data enabled this work.</w:t>
       </w:r>
     </w:p>
     <w:p>

</xml_diff>